<commit_message>
them dong ke cho phan danh gia giang vien nua
</commit_message>
<xml_diff>
--- a/TTCS remake refundgaming.docx
+++ b/TTCS remake refundgaming.docx
@@ -261,9 +261,13 @@
           <w:sz w:val="24"/>
           <w:szCs w:val="24"/>
         </w:rPr>
-        <w:t xml:space="preserve">                </w:t>
-      </w:r>
-      <w:r>
+        <w:t xml:space="preserve">                HỌC VIỆN CÔNG NGHỆ BƯU CHÍNH VIỄN THÔNG</w:t>
+      </w:r>
+    </w:p>
+    <w:p>
+      <w:pPr>
+        <w:spacing w:before="240" w:after="240" w:line="259" w:lineRule="auto"/>
+        <w:ind w:left="1440" w:firstLine="720"/>
         <w:rPr>
           <w:rFonts w:ascii="Times New Roman" w:hAnsi="Times New Roman" w:cs="Times New Roman"/>
           <w:b/>
@@ -271,13 +275,8 @@
           <w:sz w:val="24"/>
           <w:szCs w:val="24"/>
         </w:rPr>
-        <w:t>HỌC VIỆN CÔNG NGHỆ BƯU CHÍNH VIỄN THÔNG</w:t>
-      </w:r>
-    </w:p>
-    <w:p>
-      <w:pPr>
-        <w:spacing w:before="240" w:after="240" w:line="259" w:lineRule="auto"/>
-        <w:ind w:left="1440" w:firstLine="720"/>
+      </w:pPr>
+      <w:r>
         <w:rPr>
           <w:rFonts w:ascii="Times New Roman" w:hAnsi="Times New Roman" w:cs="Times New Roman"/>
           <w:b/>
@@ -285,26 +284,7 @@
           <w:sz w:val="24"/>
           <w:szCs w:val="24"/>
         </w:rPr>
-      </w:pPr>
-      <w:r>
-        <w:rPr>
-          <w:rFonts w:ascii="Times New Roman" w:hAnsi="Times New Roman" w:cs="Times New Roman"/>
-          <w:b/>
-          <w:bCs/>
-          <w:sz w:val="24"/>
-          <w:szCs w:val="24"/>
-        </w:rPr>
-        <w:t xml:space="preserve">       </w:t>
-      </w:r>
-      <w:r>
-        <w:rPr>
-          <w:rFonts w:ascii="Times New Roman" w:hAnsi="Times New Roman" w:cs="Times New Roman"/>
-          <w:b/>
-          <w:bCs/>
-          <w:sz w:val="24"/>
-          <w:szCs w:val="24"/>
-        </w:rPr>
-        <w:t>KHOA CÔNG NGHỆ THÔNG TIN 1</w:t>
+        <w:t xml:space="preserve">       KHOA CÔNG NGHỆ THÔNG TIN 1</w:t>
       </w:r>
     </w:p>
     <w:p>
@@ -427,7 +407,7 @@
           <w:sz w:val="32"/>
           <w:szCs w:val="32"/>
         </w:rPr>
-        <w:t>BÁO CÁO</w:t>
+        <w:t>BÁO CÁO ĐỒ ÁN</w:t>
       </w:r>
       <w:r>
         <w:rPr>
@@ -437,26 +417,7 @@
           <w:sz w:val="32"/>
           <w:szCs w:val="32"/>
         </w:rPr>
-        <w:t xml:space="preserve"> ĐỒ ÁN</w:t>
-      </w:r>
-      <w:r>
-        <w:rPr>
-          <w:rFonts w:ascii="Times New Roman" w:hAnsi="Times New Roman" w:cs="Times New Roman"/>
-          <w:b/>
-          <w:bCs/>
-          <w:sz w:val="32"/>
-          <w:szCs w:val="32"/>
-        </w:rPr>
         <w:br/>
-      </w:r>
-      <w:r>
-        <w:rPr>
-          <w:rFonts w:ascii="Times New Roman" w:hAnsi="Times New Roman" w:cs="Times New Roman"/>
-          <w:b/>
-          <w:bCs/>
-          <w:sz w:val="32"/>
-          <w:szCs w:val="32"/>
-        </w:rPr>
         <w:t>MÔN THỰC TẬP CƠ SỞ</w:t>
       </w:r>
     </w:p>
@@ -503,17 +464,7 @@
                 <w:sz w:val="32"/>
                 <w:szCs w:val="32"/>
               </w:rPr>
-              <w:t xml:space="preserve">Đề tài : </w:t>
-            </w:r>
-            <w:r>
-              <w:rPr>
-                <w:rFonts w:ascii="Times New Roman" w:eastAsia="Times New Roman" w:hAnsi="Times New Roman" w:cs="Times New Roman"/>
-                <w:i/>
-                <w:iCs/>
-                <w:sz w:val="32"/>
-                <w:szCs w:val="32"/>
-              </w:rPr>
-              <w:t>Tìm hiểu và ứng dụng một số cấu trúc dữ liệu và thuật toán trong phát triển Game2D</w:t>
+              <w:t>Đề tài : Tìm hiểu và ứng dụng một số cấu trúc dữ liệu và thuật toán trong phát triển Game2D</w:t>
             </w:r>
           </w:p>
         </w:tc>
@@ -1697,7 +1648,7 @@
           <w:sz w:val="26"/>
           <w:szCs w:val="26"/>
         </w:rPr>
-        <w:t xml:space="preserve">3.2.1 EntityManager - cấp phát và tái sử dụng Entity ID </w:t>
+        <w:t xml:space="preserve">3.2.1 EntityManager - cấp phát và tái sử dụng EntityID </w:t>
       </w:r>
     </w:p>
     <w:p>
@@ -2944,8 +2895,11 @@
           <w:rFonts w:ascii="Times New Roman" w:eastAsia="Times New Roman" w:hAnsi="Times New Roman" w:cs="Times New Roman"/>
           <w:b/>
           <w:bCs/>
-          <w:sz w:val="26"/>
-          <w:szCs w:val="26"/>
+          <w:i/>
+          <w:iCs/>
+          <w:sz w:val="26"/>
+          <w:szCs w:val="26"/>
+          <w:u w:val="single"/>
         </w:rPr>
       </w:pPr>
       <w:r>
@@ -2953,8 +2907,11 @@
           <w:rFonts w:ascii="Times New Roman" w:eastAsia="Times New Roman" w:hAnsi="Times New Roman" w:cs="Times New Roman"/>
           <w:b/>
           <w:bCs/>
-          <w:sz w:val="26"/>
-          <w:szCs w:val="26"/>
+          <w:i/>
+          <w:iCs/>
+          <w:sz w:val="26"/>
+          <w:szCs w:val="26"/>
+          <w:u w:val="single"/>
         </w:rPr>
         <w:lastRenderedPageBreak/>
         <w:t xml:space="preserve">NHẬN XÉT CỦA GIẢNG VIÊN HƯỚNG DẪN </w:t>
@@ -2985,6 +2942,210 @@
           <w:szCs w:val="26"/>
         </w:rPr>
       </w:pPr>
+      <w:r>
+        <w:rPr>
+          <w:rFonts w:ascii="Times New Roman" w:eastAsia="Times New Roman" w:hAnsi="Times New Roman" w:cs="Times New Roman"/>
+          <w:sz w:val="26"/>
+          <w:szCs w:val="26"/>
+        </w:rPr>
+        <w:t>................................................................................................................................</w:t>
+      </w:r>
+    </w:p>
+    <w:p>
+      <w:pPr>
+        <w:rPr>
+          <w:rFonts w:ascii="Times New Roman" w:eastAsia="Times New Roman" w:hAnsi="Times New Roman" w:cs="Times New Roman"/>
+          <w:sz w:val="26"/>
+          <w:szCs w:val="26"/>
+        </w:rPr>
+      </w:pPr>
+      <w:r>
+        <w:rPr>
+          <w:rFonts w:ascii="Times New Roman" w:eastAsia="Times New Roman" w:hAnsi="Times New Roman" w:cs="Times New Roman"/>
+          <w:sz w:val="26"/>
+          <w:szCs w:val="26"/>
+        </w:rPr>
+        <w:t>................................................................................................................................</w:t>
+      </w:r>
+    </w:p>
+    <w:p>
+      <w:pPr>
+        <w:rPr>
+          <w:rFonts w:ascii="Times New Roman" w:eastAsia="Times New Roman" w:hAnsi="Times New Roman" w:cs="Times New Roman"/>
+          <w:sz w:val="26"/>
+          <w:szCs w:val="26"/>
+        </w:rPr>
+      </w:pPr>
+      <w:r>
+        <w:rPr>
+          <w:rFonts w:ascii="Times New Roman" w:eastAsia="Times New Roman" w:hAnsi="Times New Roman" w:cs="Times New Roman"/>
+          <w:sz w:val="26"/>
+          <w:szCs w:val="26"/>
+        </w:rPr>
+        <w:t>................................................................................................................................</w:t>
+      </w:r>
+    </w:p>
+    <w:p>
+      <w:pPr>
+        <w:rPr>
+          <w:rFonts w:ascii="Times New Roman" w:eastAsia="Times New Roman" w:hAnsi="Times New Roman" w:cs="Times New Roman"/>
+          <w:sz w:val="26"/>
+          <w:szCs w:val="26"/>
+        </w:rPr>
+      </w:pPr>
+      <w:r>
+        <w:rPr>
+          <w:rFonts w:ascii="Times New Roman" w:eastAsia="Times New Roman" w:hAnsi="Times New Roman" w:cs="Times New Roman"/>
+          <w:sz w:val="26"/>
+          <w:szCs w:val="26"/>
+        </w:rPr>
+        <w:t>................................................................................................................................</w:t>
+      </w:r>
+    </w:p>
+    <w:p>
+      <w:pPr>
+        <w:rPr>
+          <w:rFonts w:ascii="Times New Roman" w:eastAsia="Times New Roman" w:hAnsi="Times New Roman" w:cs="Times New Roman"/>
+          <w:sz w:val="26"/>
+          <w:szCs w:val="26"/>
+        </w:rPr>
+      </w:pPr>
+      <w:r>
+        <w:rPr>
+          <w:rFonts w:ascii="Times New Roman" w:eastAsia="Times New Roman" w:hAnsi="Times New Roman" w:cs="Times New Roman"/>
+          <w:sz w:val="26"/>
+          <w:szCs w:val="26"/>
+        </w:rPr>
+        <w:t>................................................................................................................................</w:t>
+      </w:r>
+    </w:p>
+    <w:p>
+      <w:pPr>
+        <w:rPr>
+          <w:rFonts w:ascii="Times New Roman" w:eastAsia="Times New Roman" w:hAnsi="Times New Roman" w:cs="Times New Roman"/>
+          <w:sz w:val="26"/>
+          <w:szCs w:val="26"/>
+        </w:rPr>
+      </w:pPr>
+      <w:r>
+        <w:rPr>
+          <w:rFonts w:ascii="Times New Roman" w:eastAsia="Times New Roman" w:hAnsi="Times New Roman" w:cs="Times New Roman"/>
+          <w:sz w:val="26"/>
+          <w:szCs w:val="26"/>
+        </w:rPr>
+        <w:t>................................................................................................................................</w:t>
+      </w:r>
+    </w:p>
+    <w:p>
+      <w:pPr>
+        <w:rPr>
+          <w:rFonts w:ascii="Times New Roman" w:eastAsia="Times New Roman" w:hAnsi="Times New Roman" w:cs="Times New Roman"/>
+          <w:sz w:val="26"/>
+          <w:szCs w:val="26"/>
+        </w:rPr>
+      </w:pPr>
+      <w:r>
+        <w:rPr>
+          <w:rFonts w:ascii="Times New Roman" w:eastAsia="Times New Roman" w:hAnsi="Times New Roman" w:cs="Times New Roman"/>
+          <w:sz w:val="26"/>
+          <w:szCs w:val="26"/>
+        </w:rPr>
+        <w:t>................................................................................................................................</w:t>
+      </w:r>
+    </w:p>
+    <w:p>
+      <w:pPr>
+        <w:rPr>
+          <w:rFonts w:ascii="Times New Roman" w:eastAsia="Times New Roman" w:hAnsi="Times New Roman" w:cs="Times New Roman"/>
+          <w:sz w:val="26"/>
+          <w:szCs w:val="26"/>
+        </w:rPr>
+      </w:pPr>
+      <w:r>
+        <w:rPr>
+          <w:rFonts w:ascii="Times New Roman" w:eastAsia="Times New Roman" w:hAnsi="Times New Roman" w:cs="Times New Roman"/>
+          <w:sz w:val="26"/>
+          <w:szCs w:val="26"/>
+        </w:rPr>
+        <w:t>................................................................................................................................</w:t>
+      </w:r>
+    </w:p>
+    <w:p>
+      <w:pPr>
+        <w:rPr>
+          <w:rFonts w:ascii="Times New Roman" w:eastAsia="Times New Roman" w:hAnsi="Times New Roman" w:cs="Times New Roman"/>
+          <w:sz w:val="26"/>
+          <w:szCs w:val="26"/>
+        </w:rPr>
+      </w:pPr>
+      <w:r>
+        <w:rPr>
+          <w:rFonts w:ascii="Times New Roman" w:eastAsia="Times New Roman" w:hAnsi="Times New Roman" w:cs="Times New Roman"/>
+          <w:sz w:val="26"/>
+          <w:szCs w:val="26"/>
+        </w:rPr>
+        <w:t>................................................................................................................................</w:t>
+      </w:r>
+    </w:p>
+    <w:p>
+      <w:pPr>
+        <w:rPr>
+          <w:rFonts w:ascii="Times New Roman" w:eastAsia="Times New Roman" w:hAnsi="Times New Roman" w:cs="Times New Roman"/>
+          <w:sz w:val="26"/>
+          <w:szCs w:val="26"/>
+        </w:rPr>
+      </w:pPr>
+      <w:r>
+        <w:rPr>
+          <w:rFonts w:ascii="Times New Roman" w:eastAsia="Times New Roman" w:hAnsi="Times New Roman" w:cs="Times New Roman"/>
+          <w:sz w:val="26"/>
+          <w:szCs w:val="26"/>
+        </w:rPr>
+        <w:t>................................................................................................................................</w:t>
+      </w:r>
+    </w:p>
+    <w:p>
+      <w:pPr>
+        <w:rPr>
+          <w:rFonts w:ascii="Times New Roman" w:eastAsia="Times New Roman" w:hAnsi="Times New Roman" w:cs="Times New Roman"/>
+          <w:sz w:val="26"/>
+          <w:szCs w:val="26"/>
+        </w:rPr>
+      </w:pPr>
+      <w:r>
+        <w:rPr>
+          <w:rFonts w:ascii="Times New Roman" w:eastAsia="Times New Roman" w:hAnsi="Times New Roman" w:cs="Times New Roman"/>
+          <w:sz w:val="26"/>
+          <w:szCs w:val="26"/>
+        </w:rPr>
+        <w:t>................................................................................................................................</w:t>
+      </w:r>
+    </w:p>
+    <w:p>
+      <w:pPr>
+        <w:rPr>
+          <w:rFonts w:ascii="Times New Roman" w:eastAsia="Times New Roman" w:hAnsi="Times New Roman" w:cs="Times New Roman"/>
+          <w:sz w:val="26"/>
+          <w:szCs w:val="26"/>
+        </w:rPr>
+      </w:pPr>
+      <w:r>
+        <w:rPr>
+          <w:rFonts w:ascii="Times New Roman" w:eastAsia="Times New Roman" w:hAnsi="Times New Roman" w:cs="Times New Roman"/>
+          <w:sz w:val="26"/>
+          <w:szCs w:val="26"/>
+        </w:rPr>
+        <w:t>................................................................................................................................</w:t>
+      </w:r>
+    </w:p>
+    <w:p>
+      <w:pPr>
+        <w:rPr>
+          <w:rFonts w:ascii="Times New Roman" w:eastAsia="Times New Roman" w:hAnsi="Times New Roman" w:cs="Times New Roman"/>
+          <w:sz w:val="26"/>
+          <w:szCs w:val="26"/>
+        </w:rPr>
+      </w:pPr>
     </w:p>
     <w:p>
       <w:pPr>
@@ -3029,42 +3190,6 @@
         </w:rPr>
         <w:t xml:space="preserve">                                      </w:t>
       </w:r>
-    </w:p>
-    <w:p>
-      <w:pPr>
-        <w:rPr>
-          <w:rFonts w:ascii="Times New Roman" w:eastAsia="Times New Roman" w:hAnsi="Times New Roman" w:cs="Times New Roman"/>
-          <w:sz w:val="26"/>
-          <w:szCs w:val="26"/>
-        </w:rPr>
-      </w:pPr>
-    </w:p>
-    <w:p>
-      <w:pPr>
-        <w:rPr>
-          <w:rFonts w:ascii="Times New Roman" w:eastAsia="Times New Roman" w:hAnsi="Times New Roman" w:cs="Times New Roman"/>
-          <w:sz w:val="26"/>
-          <w:szCs w:val="26"/>
-        </w:rPr>
-      </w:pPr>
-    </w:p>
-    <w:p>
-      <w:pPr>
-        <w:rPr>
-          <w:rFonts w:ascii="Times New Roman" w:eastAsia="Times New Roman" w:hAnsi="Times New Roman" w:cs="Times New Roman"/>
-          <w:sz w:val="26"/>
-          <w:szCs w:val="26"/>
-        </w:rPr>
-      </w:pPr>
-    </w:p>
-    <w:p>
-      <w:pPr>
-        <w:rPr>
-          <w:rFonts w:ascii="Times New Roman" w:eastAsia="Times New Roman" w:hAnsi="Times New Roman" w:cs="Times New Roman"/>
-          <w:sz w:val="26"/>
-          <w:szCs w:val="26"/>
-        </w:rPr>
-      </w:pPr>
     </w:p>
     <w:p>
       <w:pPr>
@@ -3140,7 +3265,7 @@
           <w:sz w:val="26"/>
           <w:szCs w:val="26"/>
         </w:rPr>
-        <w:t xml:space="preserve">ội , ngày  </w:t>
+        <w:t xml:space="preserve">ội, ngày  </w:t>
       </w:r>
       <w:r>
         <w:rPr>
@@ -3423,96 +3548,6 @@
       <w:pPr>
         <w:rPr>
           <w:rFonts w:ascii="Times New Roman" w:eastAsia="Times New Roman" w:hAnsi="Times New Roman" w:cs="Times New Roman"/>
-          <w:sz w:val="26"/>
-          <w:szCs w:val="26"/>
-        </w:rPr>
-      </w:pPr>
-    </w:p>
-    <w:p>
-      <w:pPr>
-        <w:rPr>
-          <w:rFonts w:ascii="Times New Roman" w:eastAsia="Times New Roman" w:hAnsi="Times New Roman" w:cs="Times New Roman"/>
-          <w:sz w:val="26"/>
-          <w:szCs w:val="26"/>
-        </w:rPr>
-      </w:pPr>
-    </w:p>
-    <w:p>
-      <w:pPr>
-        <w:rPr>
-          <w:rFonts w:ascii="Times New Roman" w:eastAsia="Times New Roman" w:hAnsi="Times New Roman" w:cs="Times New Roman"/>
-          <w:sz w:val="26"/>
-          <w:szCs w:val="26"/>
-        </w:rPr>
-      </w:pPr>
-    </w:p>
-    <w:p>
-      <w:pPr>
-        <w:rPr>
-          <w:rFonts w:ascii="Times New Roman" w:eastAsia="Times New Roman" w:hAnsi="Times New Roman" w:cs="Times New Roman"/>
-          <w:sz w:val="26"/>
-          <w:szCs w:val="26"/>
-        </w:rPr>
-      </w:pPr>
-    </w:p>
-    <w:p>
-      <w:pPr>
-        <w:rPr>
-          <w:rFonts w:ascii="Times New Roman" w:eastAsia="Times New Roman" w:hAnsi="Times New Roman" w:cs="Times New Roman"/>
-          <w:sz w:val="26"/>
-          <w:szCs w:val="26"/>
-        </w:rPr>
-      </w:pPr>
-    </w:p>
-    <w:p>
-      <w:pPr>
-        <w:rPr>
-          <w:rFonts w:ascii="Times New Roman" w:eastAsia="Times New Roman" w:hAnsi="Times New Roman" w:cs="Times New Roman"/>
-          <w:sz w:val="26"/>
-          <w:szCs w:val="26"/>
-        </w:rPr>
-      </w:pPr>
-    </w:p>
-    <w:p>
-      <w:pPr>
-        <w:rPr>
-          <w:rFonts w:ascii="Times New Roman" w:eastAsia="Times New Roman" w:hAnsi="Times New Roman" w:cs="Times New Roman"/>
-          <w:sz w:val="26"/>
-          <w:szCs w:val="26"/>
-        </w:rPr>
-      </w:pPr>
-    </w:p>
-    <w:p>
-      <w:pPr>
-        <w:rPr>
-          <w:rFonts w:ascii="Times New Roman" w:eastAsia="Times New Roman" w:hAnsi="Times New Roman" w:cs="Times New Roman"/>
-          <w:sz w:val="26"/>
-          <w:szCs w:val="26"/>
-        </w:rPr>
-      </w:pPr>
-    </w:p>
-    <w:p>
-      <w:pPr>
-        <w:rPr>
-          <w:rFonts w:ascii="Times New Roman" w:eastAsia="Times New Roman" w:hAnsi="Times New Roman" w:cs="Times New Roman"/>
-          <w:sz w:val="26"/>
-          <w:szCs w:val="26"/>
-        </w:rPr>
-      </w:pPr>
-    </w:p>
-    <w:p>
-      <w:pPr>
-        <w:rPr>
-          <w:rFonts w:ascii="Times New Roman" w:eastAsia="Times New Roman" w:hAnsi="Times New Roman" w:cs="Times New Roman"/>
-          <w:sz w:val="26"/>
-          <w:szCs w:val="26"/>
-        </w:rPr>
-      </w:pPr>
-    </w:p>
-    <w:p>
-      <w:pPr>
-        <w:rPr>
-          <w:rFonts w:ascii="Times New Roman" w:eastAsia="Times New Roman" w:hAnsi="Times New Roman" w:cs="Times New Roman"/>
           <w:b/>
           <w:bCs/>
           <w:sz w:val="26"/>
@@ -3527,17 +3562,9 @@
           <w:sz w:val="26"/>
           <w:szCs w:val="26"/>
         </w:rPr>
+        <w:lastRenderedPageBreak/>
         <w:t xml:space="preserve">TÓM TẮT </w:t>
       </w:r>
-    </w:p>
-    <w:p>
-      <w:pPr>
-        <w:rPr>
-          <w:rFonts w:ascii="Times New Roman" w:eastAsia="Times New Roman" w:hAnsi="Times New Roman" w:cs="Times New Roman"/>
-          <w:sz w:val="26"/>
-          <w:szCs w:val="26"/>
-        </w:rPr>
-      </w:pPr>
     </w:p>
     <w:p>
       <w:pPr>
@@ -3594,15 +3621,6 @@
           <w:szCs w:val="26"/>
         </w:rPr>
       </w:pPr>
-    </w:p>
-    <w:p>
-      <w:pPr>
-        <w:rPr>
-          <w:rFonts w:ascii="Times New Roman" w:eastAsia="Times New Roman" w:hAnsi="Times New Roman" w:cs="Times New Roman"/>
-          <w:sz w:val="26"/>
-          <w:szCs w:val="26"/>
-        </w:rPr>
-      </w:pPr>
       <w:r>
         <w:rPr>
           <w:rFonts w:ascii="Times New Roman" w:eastAsia="Times New Roman" w:hAnsi="Times New Roman" w:cs="Times New Roman"/>
@@ -4200,6 +4218,42 @@
         <w:tab/>
         <w:t xml:space="preserve">Graphical User Interface </w:t>
       </w:r>
+    </w:p>
+    <w:p>
+      <w:pPr>
+        <w:rPr>
+          <w:rFonts w:ascii="Times New Roman" w:eastAsia="Times New Roman" w:hAnsi="Times New Roman" w:cs="Times New Roman"/>
+          <w:sz w:val="26"/>
+          <w:szCs w:val="26"/>
+        </w:rPr>
+      </w:pPr>
+    </w:p>
+    <w:p>
+      <w:pPr>
+        <w:rPr>
+          <w:rFonts w:ascii="Times New Roman" w:eastAsia="Times New Roman" w:hAnsi="Times New Roman" w:cs="Times New Roman"/>
+          <w:sz w:val="26"/>
+          <w:szCs w:val="26"/>
+        </w:rPr>
+      </w:pPr>
+    </w:p>
+    <w:p>
+      <w:pPr>
+        <w:rPr>
+          <w:rFonts w:ascii="Times New Roman" w:eastAsia="Times New Roman" w:hAnsi="Times New Roman" w:cs="Times New Roman"/>
+          <w:sz w:val="26"/>
+          <w:szCs w:val="26"/>
+        </w:rPr>
+      </w:pPr>
+    </w:p>
+    <w:p>
+      <w:pPr>
+        <w:rPr>
+          <w:rFonts w:ascii="Times New Roman" w:eastAsia="Times New Roman" w:hAnsi="Times New Roman" w:cs="Times New Roman"/>
+          <w:sz w:val="26"/>
+          <w:szCs w:val="26"/>
+        </w:rPr>
+      </w:pPr>
     </w:p>
     <w:p>
       <w:pPr>

</xml_diff>